<commit_message>
Fill practice notebooks with runnable code; fix Hebrew headings; expand reviews; reorder weekly links
- Practice notebooks now contain real, runnable PyTorch code for every
  demonstration (53 cells); smoke-tested execution on all synthetic-data weeks
  and verified the CNN/ResNet APIs for the dataset weeks
- Hebrew docs: section headings now render right-to-left (justify aligns to the
  RTL start; an explicit jc=right was flipping to the left under the bidi section)
- Expanded the prerequisite review points with brief plain-language explanations
  of each concept (no DL connection), so they state the needed background
- Weekly-materials links reordered to Lesson plan, Practice notebook, Self-check,
  Homework lab; References dropped from the table and kept on the lesson plan

Co-Authored-By: Claude Opus 4.8 <noreply@anthropic.com>
</commit_message>
<xml_diff>
--- a/hit-catalogue/syllabus_he.docx
+++ b/hit-catalogue/syllabus_he.docx
@@ -87,7 +87,7 @@
       <w:pPr>
         <w:bidi/>
         <w:spacing w:after="80"/>
-        <w:jc w:val="right"/>
+        <w:jc w:val="both"/>
       </w:pPr>
       <w:r>
         <w:rPr>
@@ -136,7 +136,7 @@
       <w:pPr>
         <w:bidi/>
         <w:spacing w:after="80"/>
-        <w:jc w:val="right"/>
+        <w:jc w:val="both"/>
       </w:pPr>
       <w:r>
         <w:rPr>
@@ -169,7 +169,7 @@
       <w:pPr>
         <w:bidi/>
         <w:spacing w:after="80"/>
-        <w:jc w:val="right"/>
+        <w:jc w:val="both"/>
       </w:pPr>
       <w:r>
         <w:rPr>
@@ -202,7 +202,7 @@
       <w:pPr>
         <w:bidi/>
         <w:spacing w:after="80"/>
-        <w:jc w:val="right"/>
+        <w:jc w:val="both"/>
       </w:pPr>
       <w:r>
         <w:rPr>
@@ -850,7 +850,7 @@
       <w:pPr>
         <w:bidi/>
         <w:spacing w:after="80"/>
-        <w:jc w:val="right"/>
+        <w:jc w:val="both"/>
       </w:pPr>
       <w:r>
         <w:rPr>

</xml_diff>